<commit_message>
Uploaded data for 2026-03-05:14-11-41
</commit_message>
<xml_diff>
--- a/Ggsc/11 Marxismus/Marx Dossier 26.docx
+++ b/Ggsc/11 Marxismus/Marx Dossier 26.docx
@@ -740,6 +740,47 @@
     <w:p>
       <w:pPr>
         <w:spacing w:before="120"/>
+        <w:ind w:left="708"/>
+        <w:rPr>
+          <w:rFonts w:asciiTheme="minorHAnsi" w:hAnsiTheme="minorHAnsi" w:cstheme="minorHAnsi"/>
+          <w:sz w:val="22"/>
+          <w:szCs w:val="22"/>
+          <w:lang w:val="de-CH"/>
+        </w:rPr>
+      </w:pPr>
+      <w:r>
+        <w:rPr>
+          <w:rFonts w:asciiTheme="minorHAnsi" w:hAnsiTheme="minorHAnsi" w:cstheme="minorHAnsi"/>
+          <w:sz w:val="22"/>
+          <w:szCs w:val="22"/>
+          <w:lang w:val="de-CH"/>
+        </w:rPr>
+        <w:t xml:space="preserve">Da es ein rieser Betrug ist, wenn der Arbeitsgeber nicht mehr Geld geben kann am Arbeiter, weil der Markt ihn dazu zwingt, obwohl er selbst noch sehr </w:t>
+      </w:r>
+      <w:r>
+        <w:rPr>
+          <w:rFonts w:asciiTheme="minorHAnsi" w:hAnsiTheme="minorHAnsi" w:cstheme="minorHAnsi"/>
+          <w:i/>
+          <w:iCs/>
+          <w:sz w:val="22"/>
+          <w:szCs w:val="22"/>
+          <w:lang w:val="de-CH"/>
+        </w:rPr>
+        <w:t xml:space="preserve">fett </w:t>
+      </w:r>
+      <w:r>
+        <w:rPr>
+          <w:rFonts w:asciiTheme="minorHAnsi" w:hAnsiTheme="minorHAnsi" w:cstheme="minorHAnsi"/>
+          <w:sz w:val="22"/>
+          <w:szCs w:val="22"/>
+          <w:lang w:val="de-CH"/>
+        </w:rPr>
+        <w:t>ist.</w:t>
+      </w:r>
+    </w:p>
+    <w:p>
+      <w:pPr>
+        <w:spacing w:before="120"/>
         <w:rPr>
           <w:sz w:val="36"/>
           <w:szCs w:val="36"/>
@@ -2564,8 +2605,12 @@
     </w:p>
     <w:p>
       <w:pPr>
+        <w:pStyle w:val="ListParagraph"/>
+        <w:numPr>
+          <w:ilvl w:val="0"/>
+          <w:numId w:val="16"/>
+        </w:numPr>
         <w:spacing w:before="120" w:line="276" w:lineRule="auto"/>
-        <w:ind w:left="3119" w:hanging="2694"/>
         <w:jc w:val="both"/>
         <w:rPr>
           <w:rFonts w:asciiTheme="minorHAnsi" w:hAnsiTheme="minorHAnsi" w:cstheme="minorHAnsi"/>
@@ -2574,15 +2619,6 @@
           <w:lang w:val="de-CH"/>
         </w:rPr>
       </w:pPr>
-      <w:r>
-        <w:rPr>
-          <w:rFonts w:asciiTheme="minorHAnsi" w:hAnsiTheme="minorHAnsi" w:cstheme="minorHAnsi"/>
-          <w:sz w:val="22"/>
-          <w:szCs w:val="32"/>
-          <w:lang w:val="de-CH"/>
-        </w:rPr>
-        <w:t xml:space="preserve">a) </w:t>
-      </w:r>
       <w:r>
         <w:rPr>
           <w:rFonts w:asciiTheme="minorHAnsi" w:hAnsiTheme="minorHAnsi" w:cstheme="minorHAnsi"/>
@@ -2621,6 +2657,92 @@
         </w:rPr>
         <w:softHyphen/>
         <w:t>verhältnisse“, „Dialektik“.</w:t>
+      </w:r>
+    </w:p>
+    <w:p>
+      <w:pPr>
+        <w:pStyle w:val="ListParagraph"/>
+        <w:spacing w:before="120" w:line="276" w:lineRule="auto"/>
+        <w:ind w:left="815"/>
+        <w:jc w:val="both"/>
+        <w:rPr>
+          <w:rFonts w:asciiTheme="minorHAnsi" w:hAnsiTheme="minorHAnsi" w:cstheme="minorHAnsi"/>
+          <w:sz w:val="22"/>
+          <w:szCs w:val="32"/>
+          <w:lang w:val="de-CH"/>
+        </w:rPr>
+      </w:pPr>
+      <w:r>
+        <w:rPr>
+          <w:rFonts w:asciiTheme="minorHAnsi" w:hAnsiTheme="minorHAnsi" w:cstheme="minorHAnsi"/>
+          <w:sz w:val="22"/>
+          <w:szCs w:val="32"/>
+          <w:lang w:val="de-CH"/>
+        </w:rPr>
+        <w:t>Der U</w:t>
+      </w:r>
+      <w:r>
+        <w:rPr>
+          <w:rFonts w:asciiTheme="minorHAnsi" w:hAnsiTheme="minorHAnsi" w:cstheme="minorHAnsi"/>
+          <w:sz w:val="22"/>
+          <w:szCs w:val="32"/>
+          <w:lang w:val="de-CH"/>
+        </w:rPr>
+        <w:t>t</w:t>
+      </w:r>
+      <w:r>
+        <w:rPr>
+          <w:rFonts w:asciiTheme="minorHAnsi" w:hAnsiTheme="minorHAnsi" w:cstheme="minorHAnsi"/>
+          <w:sz w:val="22"/>
+          <w:szCs w:val="32"/>
+          <w:lang w:val="de-CH"/>
+        </w:rPr>
+        <w:t>nterbau ist die materielle writschaftliche Ebene afgeteilt in</w:t>
+      </w:r>
+      <w:r>
+        <w:rPr>
+          <w:rFonts w:asciiTheme="minorHAnsi" w:hAnsiTheme="minorHAnsi" w:cstheme="minorHAnsi"/>
+          <w:sz w:val="22"/>
+          <w:szCs w:val="32"/>
+          <w:lang w:val="de-CH"/>
+        </w:rPr>
+        <w:t xml:space="preserve"> Produktivkräfte (Land, Geräte, Maschinen, etc.)</w:t>
+      </w:r>
+      <w:r>
+        <w:rPr>
+          <w:rFonts w:asciiTheme="minorHAnsi" w:hAnsiTheme="minorHAnsi" w:cstheme="minorHAnsi"/>
+          <w:sz w:val="22"/>
+          <w:szCs w:val="32"/>
+          <w:lang w:val="de-CH"/>
+        </w:rPr>
+        <w:t xml:space="preserve"> und Produktionsbedingungen</w:t>
+      </w:r>
+      <w:r>
+        <w:rPr>
+          <w:rFonts w:asciiTheme="minorHAnsi" w:hAnsiTheme="minorHAnsi" w:cstheme="minorHAnsi"/>
+          <w:sz w:val="22"/>
+          <w:szCs w:val="32"/>
+          <w:lang w:val="de-CH"/>
+        </w:rPr>
+        <w:t xml:space="preserve"> (besitzende und besitzlose Klasse)</w:t>
+      </w:r>
+      <w:r>
+        <w:rPr>
+          <w:rFonts w:asciiTheme="minorHAnsi" w:hAnsiTheme="minorHAnsi" w:cstheme="minorHAnsi"/>
+          <w:sz w:val="22"/>
+          <w:szCs w:val="32"/>
+          <w:lang w:val="de-CH"/>
+        </w:rPr>
+        <w:t>. Der Überbau ist die Ebene der Ideen</w:t>
+      </w:r>
+      <w:r>
+        <w:rPr>
+          <w:rFonts w:asciiTheme="minorHAnsi" w:hAnsiTheme="minorHAnsi" w:cstheme="minorHAnsi"/>
+          <w:sz w:val="22"/>
+          <w:szCs w:val="32"/>
+          <w:lang w:val="de-CH"/>
+        </w:rPr>
+        <w:t xml:space="preserve"> und ist damit der Staat, die Ideologie, das Recht, die Religion und Philisophie. Der Unterbau bestimmt jedoch alles nach Marx seiner Meinung: «Das Sein bestimmt das Bewustsein.» Der Überbau kann mit Geschichten den Unterbau kontrollieren, aber er ist abhängig von ihm.</w:t>
       </w:r>
     </w:p>
     <w:p>
@@ -2723,6 +2845,117 @@
     </w:p>
     <w:p>
       <w:pPr>
+        <w:pStyle w:val="ListParagraph"/>
+        <w:numPr>
+          <w:ilvl w:val="1"/>
+          <w:numId w:val="16"/>
+        </w:numPr>
+        <w:spacing w:before="120" w:line="276" w:lineRule="auto"/>
+        <w:jc w:val="both"/>
+        <w:rPr>
+          <w:rFonts w:asciiTheme="minorHAnsi" w:hAnsiTheme="minorHAnsi" w:cstheme="minorHAnsi"/>
+          <w:sz w:val="22"/>
+          <w:szCs w:val="32"/>
+          <w:lang w:val="de-CH"/>
+        </w:rPr>
+      </w:pPr>
+      <w:r>
+        <w:rPr>
+          <w:rFonts w:asciiTheme="minorHAnsi" w:hAnsiTheme="minorHAnsi" w:cstheme="minorHAnsi"/>
+          <w:b/>
+          <w:bCs/>
+          <w:sz w:val="22"/>
+          <w:szCs w:val="32"/>
+          <w:lang w:val="de-CH"/>
+        </w:rPr>
+        <w:t>Mehrwerttheorie</w:t>
+      </w:r>
+      <w:r>
+        <w:rPr>
+          <w:rFonts w:asciiTheme="minorHAnsi" w:hAnsiTheme="minorHAnsi" w:cstheme="minorHAnsi"/>
+          <w:sz w:val="22"/>
+          <w:szCs w:val="32"/>
+          <w:lang w:val="de-CH"/>
+        </w:rPr>
+        <w:t xml:space="preserve">: </w:t>
+      </w:r>
+      <w:r>
+        <w:rPr>
+          <w:rFonts w:asciiTheme="minorHAnsi" w:hAnsiTheme="minorHAnsi" w:cstheme="minorHAnsi"/>
+          <w:sz w:val="22"/>
+          <w:szCs w:val="32"/>
+          <w:lang w:val="de-CH"/>
+        </w:rPr>
+        <w:t>Maschienen haben Amortistationslosten und Mehrwert Proft. Menschen haben Existenz- und Fortpflanzungskosten und Mehrwert. Bei Maschienen kann man so tief runtergehen, dass man nur noch Amortisiert. Nach Marx seiner Theorie wird jedoch die Konkurenz den Mehrwert bei Menschen nicht runterdrücken.</w:t>
+      </w:r>
+    </w:p>
+    <w:p>
+      <w:pPr>
+        <w:pStyle w:val="ListParagraph"/>
+        <w:numPr>
+          <w:ilvl w:val="1"/>
+          <w:numId w:val="16"/>
+        </w:numPr>
+        <w:spacing w:before="120" w:line="276" w:lineRule="auto"/>
+        <w:jc w:val="both"/>
+        <w:rPr>
+          <w:rFonts w:asciiTheme="minorHAnsi" w:hAnsiTheme="minorHAnsi" w:cstheme="minorHAnsi"/>
+          <w:sz w:val="22"/>
+          <w:szCs w:val="32"/>
+          <w:lang w:val="de-CH"/>
+        </w:rPr>
+      </w:pPr>
+      <w:r>
+        <w:rPr>
+          <w:rFonts w:asciiTheme="minorHAnsi" w:hAnsiTheme="minorHAnsi" w:cstheme="minorHAnsi"/>
+          <w:b/>
+          <w:bCs/>
+          <w:sz w:val="22"/>
+          <w:szCs w:val="32"/>
+          <w:lang w:val="de-CH"/>
+        </w:rPr>
+        <w:t>Verelendungstheorie</w:t>
+      </w:r>
+      <w:r>
+        <w:rPr>
+          <w:rFonts w:asciiTheme="minorHAnsi" w:hAnsiTheme="minorHAnsi" w:cstheme="minorHAnsi"/>
+          <w:sz w:val="22"/>
+          <w:szCs w:val="32"/>
+          <w:lang w:val="de-CH"/>
+        </w:rPr>
+        <w:t xml:space="preserve">: </w:t>
+      </w:r>
+      <w:r>
+        <w:rPr>
+          <w:rFonts w:asciiTheme="minorHAnsi" w:hAnsiTheme="minorHAnsi" w:cstheme="minorHAnsi"/>
+          <w:sz w:val="22"/>
+          <w:szCs w:val="32"/>
+          <w:lang w:val="de-CH"/>
+        </w:rPr>
+        <w:t>Nur aus Menschen kann Profit gezogen werden, wenn immer weniger Leute auf dem Arbeitsmarkt sind, müssen anderen Leute ausgebeutet werden und immer mehr werden Arbeitslos.</w:t>
+      </w:r>
+      <w:r>
+        <w:rPr>
+          <w:rFonts w:asciiTheme="minorHAnsi" w:hAnsiTheme="minorHAnsi" w:cstheme="minorHAnsi"/>
+          <w:sz w:val="22"/>
+          <w:szCs w:val="32"/>
+          <w:lang w:val="de-CH"/>
+        </w:rPr>
+        <w:t xml:space="preserve"> </w:t>
+      </w:r>
+      <w:r>
+        <w:rPr>
+          <w:rFonts w:asciiTheme="minorHAnsi" w:hAnsiTheme="minorHAnsi" w:cstheme="minorHAnsi"/>
+          <w:sz w:val="22"/>
+          <w:szCs w:val="32"/>
+          <w:lang w:val="de-CH"/>
+        </w:rPr>
+        <w:t xml:space="preserve">Da immer mehr Menschen arbeitslos werden, sinkt die Kaufkraft und man Produkt, aber niemand kauft es, wodurch eine Kriese entsteht und manche Bankrot werden. </w:t>
+      </w:r>
+    </w:p>
+    <w:p>
+      <w:pPr>
+        <w:spacing w:line="276" w:lineRule="auto"/>
         <w:rPr>
           <w:rFonts w:asciiTheme="minorHAnsi" w:hAnsiTheme="minorHAnsi" w:cstheme="minorHAnsi"/>
           <w:bCs/>
@@ -2738,6 +2971,7 @@
           <w:ilvl w:val="0"/>
           <w:numId w:val="15"/>
         </w:numPr>
+        <w:spacing w:line="276" w:lineRule="auto"/>
         <w:rPr>
           <w:rFonts w:asciiTheme="minorHAnsi" w:hAnsiTheme="minorHAnsi" w:cstheme="minorHAnsi"/>
           <w:bCs/>
@@ -2856,6 +3090,7 @@
           <w:sz w:val="14"/>
           <w:lang w:val="de-CH"/>
         </w:rPr>
+        <w:lastRenderedPageBreak/>
         <w:drawing>
           <wp:inline distT="0" distB="0" distL="0" distR="0" wp14:anchorId="2B4E6C75" wp14:editId="2405A7E9">
             <wp:extent cx="6336665" cy="5266944"/>
@@ -2932,18 +3167,15 @@
       <w:r>
         <w:rPr>
           <w:rFonts w:asciiTheme="minorHAnsi" w:hAnsiTheme="minorHAnsi" w:cstheme="minorHAnsi"/>
-          <w:bCs/>
+          <w:b/>
           <w:i/>
           <w:sz w:val="28"/>
           <w:szCs w:val="28"/>
           <w:lang w:val="de-CH"/>
         </w:rPr>
-        <w:br w:type="page"/>
-      </w:r>
-    </w:p>
-    <w:p>
-      <w:pPr>
-        <w:spacing w:after="120"/>
+        <w:t>Graphik 2:</w:t>
+      </w:r>
+      <w:r>
         <w:rPr>
           <w:rFonts w:asciiTheme="minorHAnsi" w:hAnsiTheme="minorHAnsi" w:cstheme="minorHAnsi"/>
           <w:bCs/>
@@ -2952,41 +3184,31 @@
           <w:szCs w:val="28"/>
           <w:lang w:val="de-CH"/>
         </w:rPr>
-      </w:pPr>
-      <w:r>
-        <w:rPr>
-          <w:rFonts w:asciiTheme="minorHAnsi" w:hAnsiTheme="minorHAnsi" w:cstheme="minorHAnsi"/>
-          <w:b/>
+        <w:t xml:space="preserve"> </w:t>
+      </w:r>
+      <w:r>
+        <w:rPr>
+          <w:rFonts w:asciiTheme="minorHAnsi" w:hAnsiTheme="minorHAnsi" w:cstheme="minorHAnsi"/>
+          <w:bCs/>
           <w:i/>
           <w:sz w:val="28"/>
           <w:szCs w:val="28"/>
           <w:lang w:val="de-CH"/>
         </w:rPr>
-        <w:lastRenderedPageBreak/>
-        <w:t>Graphik 2:</w:t>
-      </w:r>
-      <w:r>
+        <w:t>Was treibt die Geschichte an?</w:t>
+      </w:r>
+    </w:p>
+    <w:p>
+      <w:pPr>
         <w:rPr>
           <w:rFonts w:asciiTheme="minorHAnsi" w:hAnsiTheme="minorHAnsi" w:cstheme="minorHAnsi"/>
           <w:bCs/>
-          <w:i/>
+          <w:iCs/>
           <w:sz w:val="28"/>
           <w:szCs w:val="28"/>
           <w:lang w:val="de-CH"/>
         </w:rPr>
-        <w:t xml:space="preserve"> </w:t>
-      </w:r>
-      <w:r>
-        <w:rPr>
-          <w:rFonts w:asciiTheme="minorHAnsi" w:hAnsiTheme="minorHAnsi" w:cstheme="minorHAnsi"/>
-          <w:bCs/>
-          <w:i/>
-          <w:sz w:val="28"/>
-          <w:szCs w:val="28"/>
-          <w:lang w:val="de-CH"/>
-        </w:rPr>
-        <w:t>Was treibt die Geschichte an?</w:t>
-      </w:r>
+      </w:pPr>
     </w:p>
     <w:p>
       <w:pPr>
@@ -3010,8 +3232,9 @@
           <w:szCs w:val="28"/>
           <w:lang w:val="de-CH"/>
         </w:rPr>
+        <w:lastRenderedPageBreak/>
         <w:drawing>
-          <wp:inline distT="0" distB="0" distL="0" distR="0" wp14:anchorId="605DAD80" wp14:editId="224EAED5">
+          <wp:inline distT="0" distB="0" distL="0" distR="0" wp14:anchorId="605DAD80" wp14:editId="310B4F01">
             <wp:extent cx="6336665" cy="3742690"/>
             <wp:effectExtent l="12700" t="12700" r="13335" b="16510"/>
             <wp:docPr id="1296232420" name="Grafik 9" descr="Ein Bild, das Text, Screenshot, Schrift, Diagramm enthält.&#10;&#10;KI-generierte Inhalte können fehlerhaft sein."/>
@@ -3073,35 +3296,6 @@
     </w:p>
     <w:p>
       <w:pPr>
-        <w:rPr>
-          <w:lang w:val="de-CH"/>
-        </w:rPr>
-      </w:pPr>
-    </w:p>
-    <w:p>
-      <w:pPr>
-        <w:jc w:val="center"/>
-        <w:rPr>
-          <w:rFonts w:asciiTheme="minorHAnsi" w:hAnsiTheme="minorHAnsi" w:cstheme="minorHAnsi"/>
-          <w:sz w:val="32"/>
-          <w:szCs w:val="32"/>
-          <w:lang w:val="de-CH"/>
-        </w:rPr>
-      </w:pPr>
-    </w:p>
-    <w:p>
-      <w:pPr>
-        <w:jc w:val="center"/>
-        <w:rPr>
-          <w:rFonts w:asciiTheme="minorHAnsi" w:hAnsiTheme="minorHAnsi" w:cstheme="minorHAnsi"/>
-          <w:sz w:val="32"/>
-          <w:szCs w:val="32"/>
-          <w:lang w:val="de-CH"/>
-        </w:rPr>
-      </w:pPr>
-    </w:p>
-    <w:p>
-      <w:pPr>
         <w:spacing w:after="120"/>
         <w:rPr>
           <w:rFonts w:asciiTheme="minorHAnsi" w:hAnsiTheme="minorHAnsi" w:cstheme="minorHAnsi"/>
@@ -3137,8 +3331,13 @@
     </w:p>
     <w:p>
       <w:pPr>
-        <w:ind w:left="-567"/>
-        <w:rPr>
+        <w:spacing w:after="120"/>
+        <w:rPr>
+          <w:rFonts w:asciiTheme="minorHAnsi" w:hAnsiTheme="minorHAnsi" w:cstheme="minorHAnsi"/>
+          <w:bCs/>
+          <w:iCs/>
+          <w:sz w:val="28"/>
+          <w:szCs w:val="28"/>
           <w:lang w:val="de-CH"/>
         </w:rPr>
       </w:pPr>
@@ -3148,9 +3347,9 @@
           <w:lang w:val="de-CH"/>
         </w:rPr>
         <w:drawing>
-          <wp:inline distT="0" distB="0" distL="0" distR="0" wp14:anchorId="37BC50EE" wp14:editId="07033D2D">
-            <wp:extent cx="7073900" cy="2908529"/>
-            <wp:effectExtent l="12700" t="12700" r="12700" b="12700"/>
+          <wp:inline distT="0" distB="0" distL="0" distR="0" wp14:anchorId="2B8D0371" wp14:editId="119F77AA">
+            <wp:extent cx="6267076" cy="2576792"/>
+            <wp:effectExtent l="19050" t="19050" r="19685" b="14605"/>
             <wp:docPr id="1071798716" name="Grafik 1" descr="Ein Bild, das Reihe, Diagramm, parallel, Plan enthält.&#10;&#10;KI-generierte Inhalte können fehlerhaft sein."/>
             <wp:cNvGraphicFramePr>
               <a:graphicFrameLocks xmlns:a="http://schemas.openxmlformats.org/drawingml/2006/main" noChangeAspect="1"/>
@@ -3177,7 +3376,7 @@
                   <pic:spPr>
                     <a:xfrm>
                       <a:off x="0" y="0"/>
-                      <a:ext cx="7106573" cy="2921963"/>
+                      <a:ext cx="6299813" cy="2590252"/>
                     </a:xfrm>
                     <a:prstGeom prst="rect">
                       <a:avLst/>
@@ -3197,6 +3396,14 @@
           </wp:inline>
         </w:drawing>
       </w:r>
+    </w:p>
+    <w:p>
+      <w:pPr>
+        <w:ind w:left="-567"/>
+        <w:rPr>
+          <w:lang w:val="de-CH"/>
+        </w:rPr>
+      </w:pPr>
     </w:p>
     <w:p>
       <w:pPr>
@@ -6779,6 +6986,95 @@
     </w:lvl>
   </w:abstractNum>
   <w:abstractNum w:abstractNumId="14" w15:restartNumberingAfterBreak="0">
+    <w:nsid w:val="653F5ECD"/>
+    <w:multiLevelType w:val="hybridMultilevel"/>
+    <w:tmpl w:val="F6F01A2E"/>
+    <w:lvl w:ilvl="0" w:tplc="2F9C0296">
+      <w:start w:val="1"/>
+      <w:numFmt w:val="lowerLetter"/>
+      <w:lvlText w:val="%1)"/>
+      <w:lvlJc w:val="left"/>
+      <w:pPr>
+        <w:ind w:left="815" w:hanging="390"/>
+      </w:pPr>
+      <w:rPr>
+        <w:rFonts w:hint="default"/>
+      </w:rPr>
+    </w:lvl>
+    <w:lvl w:ilvl="1" w:tplc="10000019">
+      <w:start w:val="1"/>
+      <w:numFmt w:val="lowerLetter"/>
+      <w:lvlText w:val="%2."/>
+      <w:lvlJc w:val="left"/>
+      <w:pPr>
+        <w:ind w:left="1505" w:hanging="360"/>
+      </w:pPr>
+    </w:lvl>
+    <w:lvl w:ilvl="2" w:tplc="1000001B" w:tentative="1">
+      <w:start w:val="1"/>
+      <w:numFmt w:val="lowerRoman"/>
+      <w:lvlText w:val="%3."/>
+      <w:lvlJc w:val="right"/>
+      <w:pPr>
+        <w:ind w:left="2225" w:hanging="180"/>
+      </w:pPr>
+    </w:lvl>
+    <w:lvl w:ilvl="3" w:tplc="1000000F" w:tentative="1">
+      <w:start w:val="1"/>
+      <w:numFmt w:val="decimal"/>
+      <w:lvlText w:val="%4."/>
+      <w:lvlJc w:val="left"/>
+      <w:pPr>
+        <w:ind w:left="2945" w:hanging="360"/>
+      </w:pPr>
+    </w:lvl>
+    <w:lvl w:ilvl="4" w:tplc="10000019" w:tentative="1">
+      <w:start w:val="1"/>
+      <w:numFmt w:val="lowerLetter"/>
+      <w:lvlText w:val="%5."/>
+      <w:lvlJc w:val="left"/>
+      <w:pPr>
+        <w:ind w:left="3665" w:hanging="360"/>
+      </w:pPr>
+    </w:lvl>
+    <w:lvl w:ilvl="5" w:tplc="1000001B" w:tentative="1">
+      <w:start w:val="1"/>
+      <w:numFmt w:val="lowerRoman"/>
+      <w:lvlText w:val="%6."/>
+      <w:lvlJc w:val="right"/>
+      <w:pPr>
+        <w:ind w:left="4385" w:hanging="180"/>
+      </w:pPr>
+    </w:lvl>
+    <w:lvl w:ilvl="6" w:tplc="1000000F" w:tentative="1">
+      <w:start w:val="1"/>
+      <w:numFmt w:val="decimal"/>
+      <w:lvlText w:val="%7."/>
+      <w:lvlJc w:val="left"/>
+      <w:pPr>
+        <w:ind w:left="5105" w:hanging="360"/>
+      </w:pPr>
+    </w:lvl>
+    <w:lvl w:ilvl="7" w:tplc="10000019" w:tentative="1">
+      <w:start w:val="1"/>
+      <w:numFmt w:val="lowerLetter"/>
+      <w:lvlText w:val="%8."/>
+      <w:lvlJc w:val="left"/>
+      <w:pPr>
+        <w:ind w:left="5825" w:hanging="360"/>
+      </w:pPr>
+    </w:lvl>
+    <w:lvl w:ilvl="8" w:tplc="1000001B" w:tentative="1">
+      <w:start w:val="1"/>
+      <w:numFmt w:val="lowerRoman"/>
+      <w:lvlText w:val="%9."/>
+      <w:lvlJc w:val="right"/>
+      <w:pPr>
+        <w:ind w:left="6545" w:hanging="180"/>
+      </w:pPr>
+    </w:lvl>
+  </w:abstractNum>
+  <w:abstractNum w:abstractNumId="15" w15:restartNumberingAfterBreak="0">
     <w:nsid w:val="753D7B25"/>
     <w:multiLevelType w:val="hybridMultilevel"/>
     <w:tmpl w:val="FD38D3BA"/>
@@ -6910,10 +7206,13 @@
     <w:abstractNumId w:val="2"/>
   </w:num>
   <w:num w:numId="14" w16cid:durableId="1260482902">
-    <w:abstractNumId w:val="14"/>
+    <w:abstractNumId w:val="15"/>
   </w:num>
   <w:num w:numId="15" w16cid:durableId="625552080">
     <w:abstractNumId w:val="9"/>
+  </w:num>
+  <w:num w:numId="16" w16cid:durableId="674840793">
+    <w:abstractNumId w:val="14"/>
   </w:num>
 </w:numbering>
 </file>
@@ -7892,26 +8191,6 @@
 </file>
 
 <file path=customXml/item1.xml><?xml version="1.0" encoding="utf-8"?>
-<p:properties xmlns:p="http://schemas.microsoft.com/office/2006/metadata/properties" xmlns:xsi="http://www.w3.org/2001/XMLSchema-instance" xmlns:pc="http://schemas.microsoft.com/office/infopath/2007/PartnerControls">
-  <documentManagement>
-    <lcf76f155ced4ddcb4097134ff3c332f xmlns="c6ec2303-bb64-4cac-97ca-3c4e0a87e3e9">
-      <Terms xmlns="http://schemas.microsoft.com/office/infopath/2007/PartnerControls"/>
-    </lcf76f155ced4ddcb4097134ff3c332f>
-    <TaxCatchAll xmlns="6affbfad-6606-4d5a-976f-ff5613f8648f" xsi:nil="true"/>
-  </documentManagement>
-</p:properties>
-</file>
-
-<file path=customXml/item2.xml><?xml version="1.0" encoding="utf-8"?>
-<?mso-contentType ?>
-<FormTemplates xmlns="http://schemas.microsoft.com/sharepoint/v3/contenttype/forms">
-  <Display>DocumentLibraryForm</Display>
-  <Edit>DocumentLibraryForm</Edit>
-  <New>DocumentLibraryForm</New>
-</FormTemplates>
-</file>
-
-<file path=customXml/item3.xml><?xml version="1.0" encoding="utf-8"?>
 <ct:contentTypeSchema xmlns:ct="http://schemas.microsoft.com/office/2006/metadata/contentType" xmlns:ma="http://schemas.microsoft.com/office/2006/metadata/properties/metaAttributes" ct:_="" ma:_="" ma:contentTypeName="Dokument" ma:contentTypeID="0x010100652F7E22E2E6A1478BD0B7DD613FD915" ma:contentTypeVersion="13" ma:contentTypeDescription="Ein neues Dokument erstellen." ma:contentTypeScope="" ma:versionID="2ef79b2958d60c677a9186e6e9815ac5">
   <xsd:schema xmlns:xsd="http://www.w3.org/2001/XMLSchema" xmlns:xs="http://www.w3.org/2001/XMLSchema" xmlns:p="http://schemas.microsoft.com/office/2006/metadata/properties" xmlns:ns2="c6ec2303-bb64-4cac-97ca-3c4e0a87e3e9" xmlns:ns3="6affbfad-6606-4d5a-976f-ff5613f8648f" targetNamespace="http://schemas.microsoft.com/office/2006/metadata/properties" ma:root="true" ma:fieldsID="5f0480a7388f6a473c37edc5a04138ce" ns2:_="" ns3:_="">
     <xsd:import namespace="c6ec2303-bb64-4cac-97ca-3c4e0a87e3e9"/>
@@ -8118,26 +8397,27 @@
 </ct:contentTypeSchema>
 </file>
 
-<file path=customXml/itemProps1.xml><?xml version="1.0" encoding="utf-8"?>
-<ds:datastoreItem xmlns:ds="http://schemas.openxmlformats.org/officeDocument/2006/customXml" ds:itemID="{67EFE651-591E-4204-ACC4-84C0A00D9A56}">
-  <ds:schemaRefs>
-    <ds:schemaRef ds:uri="http://schemas.microsoft.com/office/2006/metadata/properties"/>
-    <ds:schemaRef ds:uri="http://schemas.microsoft.com/office/infopath/2007/PartnerControls"/>
-    <ds:schemaRef ds:uri="c6ec2303-bb64-4cac-97ca-3c4e0a87e3e9"/>
-    <ds:schemaRef ds:uri="6affbfad-6606-4d5a-976f-ff5613f8648f"/>
-  </ds:schemaRefs>
-</ds:datastoreItem>
+<file path=customXml/item2.xml><?xml version="1.0" encoding="utf-8"?>
+<?mso-contentType ?>
+<FormTemplates xmlns="http://schemas.microsoft.com/sharepoint/v3/contenttype/forms">
+  <Display>DocumentLibraryForm</Display>
+  <Edit>DocumentLibraryForm</Edit>
+  <New>DocumentLibraryForm</New>
+</FormTemplates>
 </file>
 
-<file path=customXml/itemProps2.xml><?xml version="1.0" encoding="utf-8"?>
-<ds:datastoreItem xmlns:ds="http://schemas.openxmlformats.org/officeDocument/2006/customXml" ds:itemID="{B73341FF-6D40-4AC1-868C-E8B361F182A8}">
-  <ds:schemaRefs>
-    <ds:schemaRef ds:uri="http://schemas.microsoft.com/sharepoint/v3/contenttype/forms"/>
-  </ds:schemaRefs>
-</ds:datastoreItem>
+<file path=customXml/item3.xml><?xml version="1.0" encoding="utf-8"?>
+<p:properties xmlns:p="http://schemas.microsoft.com/office/2006/metadata/properties" xmlns:xsi="http://www.w3.org/2001/XMLSchema-instance" xmlns:pc="http://schemas.microsoft.com/office/infopath/2007/PartnerControls">
+  <documentManagement>
+    <lcf76f155ced4ddcb4097134ff3c332f xmlns="c6ec2303-bb64-4cac-97ca-3c4e0a87e3e9">
+      <Terms xmlns="http://schemas.microsoft.com/office/infopath/2007/PartnerControls"/>
+    </lcf76f155ced4ddcb4097134ff3c332f>
+    <TaxCatchAll xmlns="6affbfad-6606-4d5a-976f-ff5613f8648f" xsi:nil="true"/>
+  </documentManagement>
+</p:properties>
 </file>
 
-<file path=customXml/itemProps3.xml><?xml version="1.0" encoding="utf-8"?>
+<file path=customXml/itemProps1.xml><?xml version="1.0" encoding="utf-8"?>
 <ds:datastoreItem xmlns:ds="http://schemas.openxmlformats.org/officeDocument/2006/customXml" ds:itemID="{FD7FBA37-FC3B-49E1-85BE-1D4F5BAB6A2D}">
   <ds:schemaRefs>
     <ds:schemaRef ds:uri="http://schemas.microsoft.com/office/2006/metadata/contentType"/>
@@ -8154,4 +8434,23 @@
     <ds:schemaRef ds:uri="http://schemas.microsoft.com/internal/obd"/>
   </ds:schemaRefs>
 </ds:datastoreItem>
+</file>
+
+<file path=customXml/itemProps2.xml><?xml version="1.0" encoding="utf-8"?>
+<ds:datastoreItem xmlns:ds="http://schemas.openxmlformats.org/officeDocument/2006/customXml" ds:itemID="{B73341FF-6D40-4AC1-868C-E8B361F182A8}">
+  <ds:schemaRefs>
+    <ds:schemaRef ds:uri="http://schemas.microsoft.com/sharepoint/v3/contenttype/forms"/>
+  </ds:schemaRefs>
+</ds:datastoreItem>
+</file>
+
+<file path=customXml/itemProps3.xml><?xml version="1.0" encoding="utf-8"?>
+<ds:datastoreItem xmlns:ds="http://schemas.openxmlformats.org/officeDocument/2006/customXml" ds:itemID="{67EFE651-591E-4204-ACC4-84C0A00D9A56}">
+  <ds:schemaRefs>
+    <ds:schemaRef ds:uri="http://schemas.microsoft.com/office/2006/metadata/properties"/>
+    <ds:schemaRef ds:uri="http://schemas.microsoft.com/office/infopath/2007/PartnerControls"/>
+    <ds:schemaRef ds:uri="c6ec2303-bb64-4cac-97ca-3c4e0a87e3e9"/>
+    <ds:schemaRef ds:uri="6affbfad-6606-4d5a-976f-ff5613f8648f"/>
+  </ds:schemaRefs>
+</ds:datastoreItem>
 </file>
</xml_diff>